<commit_message>
docs: Update project specification
</commit_message>
<xml_diff>
--- a/Documentation/bsi-especificacao-projeto-frota-rural.docx
+++ b/Documentation/bsi-especificacao-projeto-frota-rural.docx
@@ -298,25 +298,12 @@
                               <w:t xml:space="preserve">Prof. Evandro </w:t>
                             </w:r>
                             <w:r>
-                              <w:t xml:space="preserve">Alberto </w:t>
+                              <w:t>Alberto Zatti</w:t>
                             </w:r>
-                            <w:proofErr w:type="spellStart"/>
-                            <w:r>
-                              <w:t>Zatti</w:t>
-                            </w:r>
-                            <w:proofErr w:type="spellEnd"/>
                           </w:p>
                           <w:p>
                             <w:r>
-                              <w:t xml:space="preserve">Prof. </w:t>
-                            </w:r>
-                            <w:proofErr w:type="spellStart"/>
-                            <w:r>
-                              <w:t>Geucimar</w:t>
-                            </w:r>
-                            <w:proofErr w:type="spellEnd"/>
-                            <w:r>
-                              <w:t xml:space="preserve"> Briatore</w:t>
+                              <w:t>Prof. Geucimar Briatore</w:t>
                             </w:r>
                           </w:p>
                           <w:p>
@@ -350,13 +337,13 @@
               </wp:anchor>
             </w:drawing>
           </mc:Choice>
-          <mc:Fallback xmlns:a="http://schemas.openxmlformats.org/drawingml/2006/main" xmlns:pic="http://schemas.openxmlformats.org/drawingml/2006/picture" xmlns:a14="http://schemas.microsoft.com/office/drawing/2010/main">
+          <mc:Fallback>
             <w:pict>
-              <v:shapetype id="_x0000_t202" coordsize="21600,21600" o:spt="202" path="m,l,21600r21600,l21600,xe" w14:anchorId="71174E72">
+              <v:shapetype w14:anchorId="71174E72" id="_x0000_t202" coordsize="21600,21600" o:spt="202" path="m,l,21600r21600,l21600,xe">
                 <v:stroke joinstyle="miter"/>
                 <v:path gradientshapeok="t" o:connecttype="rect"/>
               </v:shapetype>
-              <v:shape id="Caixa de Texto 2" style="position:absolute;left:0;text-align:left;margin-left:247.5pt;margin-top:60.4pt;width:220.25pt;height:110.6pt;z-index:251658240;visibility:visible;mso-wrap-style:square;mso-width-percent:0;mso-height-percent:200;mso-wrap-distance-left:9pt;mso-wrap-distance-top:3.6pt;mso-wrap-distance-right:9pt;mso-wrap-distance-bottom:3.6pt;mso-position-horizontal:absolute;mso-position-horizontal-relative:text;mso-position-vertical:absolute;mso-position-vertical-relative:text;mso-width-percent:0;mso-height-percent:200;mso-width-relative:margin;mso-height-relative:margin;v-text-anchor:top" o:spid="_x0000_s1026" stroked="f" type="#_x0000_t202" o:gfxdata="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">
+              <v:shape id="Caixa de Texto 2" o:spid="_x0000_s1026" type="#_x0000_t202" style="position:absolute;left:0;text-align:left;margin-left:247.5pt;margin-top:60.4pt;width:220.25pt;height:110.6pt;z-index:251658240;visibility:visible;mso-wrap-style:square;mso-width-percent:0;mso-height-percent:200;mso-wrap-distance-left:9pt;mso-wrap-distance-top:3.6pt;mso-wrap-distance-right:9pt;mso-wrap-distance-bottom:3.6pt;mso-position-horizontal:absolute;mso-position-horizontal-relative:text;mso-position-vertical:absolute;mso-position-vertical-relative:text;mso-width-percent:0;mso-height-percent:200;mso-width-relative:margin;mso-height-relative:margin;v-text-anchor:top" o:gfxdata="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" stroked="f">
                 <v:textbox style="mso-fit-shape-to-text:t">
                   <w:txbxContent>
                     <w:p>
@@ -2054,18 +2041,8 @@
                 <w:sz w:val="24"/>
                 <w:szCs w:val="24"/>
               </w:rPr>
-              <w:t>2. Cadastro de maquinário considerando registro de identificação oficial do equipamento (</w:t>
-            </w:r>
-            <w:proofErr w:type="spellStart"/>
-            <w:r>
-              <w:rPr>
-                <w:color w:val="000000" w:themeColor="text1"/>
-                <w:sz w:val="24"/>
-                <w:szCs w:val="24"/>
-              </w:rPr>
-              <w:t>Renagro</w:t>
-            </w:r>
-            <w:proofErr w:type="spellEnd"/>
+              <w:t>2. Cadastro de maquinário considerando registro de identificação oficial do equipamento (Renagro</w:t>
+            </w:r>
             <w:r>
               <w:rPr>
                 <w:rStyle w:val="FootnoteReference"/>
@@ -2885,18 +2862,8 @@
                 <w:sz w:val="24"/>
                 <w:szCs w:val="24"/>
               </w:rPr>
-              <w:t xml:space="preserve">2. Processos de locação pouco formalizados, sem verificação no </w:t>
-            </w:r>
-            <w:proofErr w:type="spellStart"/>
-            <w:r>
-              <w:rPr>
-                <w:color w:val="000000" w:themeColor="text1"/>
-                <w:sz w:val="24"/>
-                <w:szCs w:val="24"/>
-              </w:rPr>
-              <w:t>Renagro</w:t>
-            </w:r>
-            <w:proofErr w:type="spellEnd"/>
+              <w:t>2. Processos de locação pouco formalizados, sem verificação no Renagro</w:t>
+            </w:r>
             <w:r>
               <w:rPr>
                 <w:rStyle w:val="FootnoteReference"/>
@@ -4181,13 +4148,6 @@
             <w:r>
               <w:t xml:space="preserve">Realizar Autenticação de Usuário </w:t>
             </w:r>
-          </w:p>
-          <w:p>
-            <w:pPr>
-              <w:tabs>
-                <w:tab w:val="left" w:pos="3194"/>
-              </w:tabs>
-            </w:pPr>
             <w:r>
               <w:tab/>
             </w:r>
@@ -4609,11 +4569,7 @@
               <w:ind w:left="-5"/>
             </w:pPr>
             <w:r>
-              <w:rPr>
-                <w:rFonts w:eastAsia="Aptos" w:cs="Aptos"/>
-                <w:color w:val="000000" w:themeColor="text1"/>
-              </w:rPr>
-              <w:t>Processar Contratação de Aluguel</w:t>
+              <w:t>Alugar Maquinário em Anúncio</w:t>
             </w:r>
           </w:p>
         </w:tc>
@@ -4627,6 +4583,7 @@
               <w:rPr>
                 <w:rFonts w:eastAsia="Aptos" w:cs="Aptos"/>
                 <w:color w:val="000000" w:themeColor="text1"/>
+                <w:highlight w:val="yellow"/>
               </w:rPr>
             </w:pPr>
             <w:r>
@@ -4635,39 +4592,6 @@
                 <w:color w:val="000000" w:themeColor="text1"/>
               </w:rPr>
               <w:t>Locatário</w:t>
-            </w:r>
-          </w:p>
-          <w:p>
-            <w:pPr>
-              <w:spacing w:before="220" w:after="220"/>
-              <w:rPr>
-                <w:rFonts w:eastAsia="Aptos" w:cs="Aptos"/>
-                <w:color w:val="000000" w:themeColor="text1"/>
-              </w:rPr>
-            </w:pPr>
-            <w:r>
-              <w:rPr>
-                <w:rFonts w:eastAsia="Aptos" w:cs="Aptos"/>
-                <w:color w:val="000000" w:themeColor="text1"/>
-              </w:rPr>
-              <w:lastRenderedPageBreak/>
-              <w:t>Locador</w:t>
-            </w:r>
-          </w:p>
-          <w:p>
-            <w:pPr>
-              <w:spacing w:before="220" w:after="220"/>
-              <w:rPr>
-                <w:rFonts w:eastAsia="Aptos" w:cs="Aptos"/>
-                <w:color w:val="000000" w:themeColor="text1"/>
-              </w:rPr>
-            </w:pPr>
-            <w:r>
-              <w:rPr>
-                <w:rFonts w:eastAsia="Aptos" w:cs="Aptos"/>
-                <w:color w:val="000000" w:themeColor="text1"/>
-              </w:rPr>
-              <w:t>Operador</w:t>
             </w:r>
           </w:p>
         </w:tc>
@@ -4683,8 +4607,7 @@
               <w:jc w:val="center"/>
             </w:pPr>
             <w:r>
-              <w:lastRenderedPageBreak/>
-              <w:t>1</w:t>
+              <w:t>2</w:t>
             </w:r>
           </w:p>
         </w:tc>
@@ -4714,6 +4637,7 @@
                 <w:bCs/>
                 <w:color w:val="000000" w:themeColor="text1"/>
               </w:rPr>
+              <w:lastRenderedPageBreak/>
               <w:t>RF</w:t>
             </w:r>
             <w:r>
@@ -4778,7 +4702,7 @@
               <w:jc w:val="center"/>
             </w:pPr>
             <w:r>
-              <w:t>1</w:t>
+              <w:t>2</w:t>
             </w:r>
           </w:p>
         </w:tc>
@@ -4889,7 +4813,7 @@
               <w:jc w:val="center"/>
             </w:pPr>
             <w:r>
-              <w:t>1</w:t>
+              <w:t>2</w:t>
             </w:r>
           </w:p>
         </w:tc>
@@ -5066,23 +4990,7 @@
                 <w:rFonts w:eastAsia="Aptos" w:cs="Aptos"/>
                 <w:color w:val="000000" w:themeColor="text1"/>
               </w:rPr>
-              <w:t xml:space="preserve">Calcular Cobrança Baseada no </w:t>
-            </w:r>
-            <w:proofErr w:type="spellStart"/>
-            <w:r>
-              <w:rPr>
-                <w:rFonts w:eastAsia="Aptos" w:cs="Aptos"/>
-                <w:color w:val="000000" w:themeColor="text1"/>
-              </w:rPr>
-              <w:t>Horímetro</w:t>
-            </w:r>
-            <w:proofErr w:type="spellEnd"/>
-            <w:r>
-              <w:rPr>
-                <w:rFonts w:eastAsia="Aptos" w:cs="Aptos"/>
-                <w:color w:val="000000" w:themeColor="text1"/>
-              </w:rPr>
-              <w:t xml:space="preserve"> do Maquinário</w:t>
+              <w:t>Calcular Cobrança Baseada no Horímetro do Maquinário</w:t>
             </w:r>
           </w:p>
         </w:tc>
@@ -5185,52 +5093,10 @@
             </w:pPr>
             <w:r>
               <w:rPr>
-                <w:rFonts w:eastAsia="Aptos" w:cs="Aptos"/>
-                <w:color w:val="000000" w:themeColor="text1"/>
-              </w:rPr>
-              <w:t>Atualiza</w:t>
-            </w:r>
-            <w:r>
-              <w:rPr>
-                <w:rFonts w:eastAsia="Aptos" w:cs="Aptos"/>
-                <w:color w:val="000000" w:themeColor="text1"/>
-              </w:rPr>
-              <w:t>r</w:t>
-            </w:r>
-            <w:r>
-              <w:rPr>
-                <w:rFonts w:eastAsia="Aptos" w:cs="Aptos"/>
-                <w:color w:val="000000" w:themeColor="text1"/>
-              </w:rPr>
-              <w:t xml:space="preserve"> </w:t>
-            </w:r>
-            <w:r>
-              <w:rPr>
-                <w:rFonts w:eastAsia="Aptos" w:cs="Aptos"/>
-                <w:color w:val="000000" w:themeColor="text1"/>
-              </w:rPr>
-              <w:t>Dados</w:t>
-            </w:r>
-            <w:r>
-              <w:rPr>
-                <w:rFonts w:eastAsia="Aptos" w:cs="Aptos"/>
-                <w:color w:val="000000" w:themeColor="text1"/>
-              </w:rPr>
-              <w:t xml:space="preserve"> </w:t>
-            </w:r>
-            <w:r>
-              <w:rPr>
-                <w:rFonts w:eastAsia="Aptos" w:cs="Aptos"/>
-                <w:color w:val="000000" w:themeColor="text1"/>
-              </w:rPr>
-              <w:t>d</w:t>
-            </w:r>
-            <w:r>
-              <w:rPr>
-                <w:rFonts w:eastAsia="Aptos" w:cs="Aptos"/>
-                <w:color w:val="000000" w:themeColor="text1"/>
-              </w:rPr>
-              <w:t>a Locação</w:t>
+                <w:rFonts w:eastAsia="Arial" w:cs="Arial"/>
+                <w:color w:val="000000" w:themeColor="text1"/>
+              </w:rPr>
+              <w:t>Receber Notificações Sobre a Locação</w:t>
             </w:r>
           </w:p>
         </w:tc>
@@ -5409,7 +5275,7 @@
                 <w:rFonts w:eastAsia="Aptos" w:cs="Aptos"/>
                 <w:color w:val="000000" w:themeColor="text1"/>
               </w:rPr>
-              <w:t>2</w:t>
+              <w:t>1</w:t>
             </w:r>
           </w:p>
         </w:tc>
@@ -5531,7 +5397,7 @@
                 <w:rFonts w:eastAsia="Aptos" w:cs="Aptos"/>
                 <w:color w:val="000000" w:themeColor="text1"/>
               </w:rPr>
-              <w:t>2</w:t>
+              <w:t>1</w:t>
             </w:r>
           </w:p>
         </w:tc>
@@ -5674,7 +5540,7 @@
                 <w:rFonts w:eastAsia="Aptos" w:cs="Aptos"/>
                 <w:color w:val="000000" w:themeColor="text1"/>
               </w:rPr>
-              <w:t>1</w:t>
+              <w:t>3</w:t>
             </w:r>
           </w:p>
         </w:tc>
@@ -5801,7 +5667,7 @@
                 <w:rFonts w:eastAsia="Aptos" w:cs="Aptos"/>
                 <w:color w:val="000000" w:themeColor="text1"/>
               </w:rPr>
-              <w:t>1</w:t>
+              <w:t>2</w:t>
             </w:r>
           </w:p>
         </w:tc>
@@ -5907,7 +5773,7 @@
                 <w:rFonts w:eastAsia="Aptos" w:cs="Aptos"/>
                 <w:color w:val="000000" w:themeColor="text1"/>
               </w:rPr>
-              <w:t>2</w:t>
+              <w:t>3</w:t>
             </w:r>
           </w:p>
         </w:tc>
@@ -6044,7 +5910,6 @@
                 <w:bCs/>
                 <w:color w:val="000000" w:themeColor="text1"/>
               </w:rPr>
-              <w:lastRenderedPageBreak/>
               <w:t>RF1</w:t>
             </w:r>
             <w:r>
@@ -6126,7 +5991,6 @@
         </w:tc>
       </w:tr>
     </w:tbl>
-    <w:p/>
     <w:p>
       <w:pPr>
         <w:rPr>
@@ -6136,9 +6000,6 @@
         </w:rPr>
       </w:pPr>
       <w:bookmarkStart w:id="9" w:name="_Ref95112547"/>
-      <w:r>
-        <w:br w:type="page"/>
-      </w:r>
     </w:p>
     <w:p>
       <w:pPr>
@@ -6269,21 +6130,13 @@
                 <w:b/>
                 <w:bCs/>
               </w:rPr>
-              <w:t>POSSO: g</w:t>
-            </w:r>
-            <w:r>
-              <w:rPr>
-                <w:rFonts w:eastAsia="Aptos" w:cs="Aptos"/>
-              </w:rPr>
-              <w:t>erenciar Cadastro de Usuário</w:t>
-            </w:r>
-            <w:r>
-              <w:rPr>
-                <w:rFonts w:eastAsia="Aptos" w:cs="Aptos"/>
-                <w:b/>
-                <w:bCs/>
-              </w:rPr>
-              <w:t xml:space="preserve"> </w:t>
+              <w:t xml:space="preserve">POSSO: </w:t>
+            </w:r>
+            <w:r>
+              <w:rPr>
+                <w:rFonts w:eastAsia="Aptos" w:cs="Aptos"/>
+              </w:rPr>
+              <w:t>Gerenciar Cadastro de Usuário</w:t>
             </w:r>
           </w:p>
           <w:p>
@@ -6449,14 +6302,12 @@
               </w:rPr>
               <w:t xml:space="preserve">Cadastro </w:t>
             </w:r>
-            <w:proofErr w:type="spellStart"/>
-            <w:r>
-              <w:rPr>
-                <w:rFonts w:eastAsia="Aptos" w:cs="Aptos"/>
-              </w:rPr>
-              <w:t>mal-sucedido</w:t>
-            </w:r>
-            <w:proofErr w:type="spellEnd"/>
+            <w:r>
+              <w:rPr>
+                <w:rFonts w:eastAsia="Aptos" w:cs="Aptos"/>
+              </w:rPr>
+              <w:t>malsucedido</w:t>
+            </w:r>
           </w:p>
           <w:p>
             <w:pPr>
@@ -6667,14 +6518,12 @@
               </w:rPr>
               <w:t xml:space="preserve">Manutenção de dados </w:t>
             </w:r>
-            <w:proofErr w:type="spellStart"/>
-            <w:r>
-              <w:rPr>
-                <w:rFonts w:eastAsia="Aptos" w:cs="Aptos"/>
-              </w:rPr>
-              <w:t>mal-sucedida</w:t>
-            </w:r>
-            <w:proofErr w:type="spellEnd"/>
+            <w:r>
+              <w:rPr>
+                <w:rFonts w:eastAsia="Aptos" w:cs="Aptos"/>
+              </w:rPr>
+              <w:t>malsucedida</w:t>
+            </w:r>
           </w:p>
           <w:p>
             <w:pPr>
@@ -6858,13 +6707,13 @@
                 <w:b/>
                 <w:bCs/>
               </w:rPr>
-              <w:t>POSSO: r</w:t>
-            </w:r>
-            <w:r>
-              <w:rPr>
-                <w:rFonts w:eastAsia="Aptos" w:cs="Aptos"/>
-              </w:rPr>
-              <w:t>ealizar Autenticação de Usuário</w:t>
+              <w:t xml:space="preserve">POSSO: </w:t>
+            </w:r>
+            <w:r>
+              <w:rPr>
+                <w:rFonts w:eastAsia="Aptos" w:cs="Aptos"/>
+              </w:rPr>
+              <w:t>Realizar Autenticação de Usuário</w:t>
             </w:r>
           </w:p>
           <w:p>
@@ -6994,14 +6843,12 @@
               </w:rPr>
               <w:t xml:space="preserve">o sistema </w:t>
             </w:r>
-            <w:proofErr w:type="gramStart"/>
-            <w:r>
-              <w:rPr>
-                <w:rFonts w:eastAsia="Aptos" w:cs="Aptos"/>
-              </w:rPr>
-              <w:t>autentica</w:t>
-            </w:r>
-            <w:proofErr w:type="gramEnd"/>
+            <w:r>
+              <w:rPr>
+                <w:rFonts w:eastAsia="Aptos" w:cs="Aptos"/>
+              </w:rPr>
+              <w:t>faz a autenticação</w:t>
+            </w:r>
             <w:r>
               <w:rPr>
                 <w:rFonts w:eastAsia="Aptos" w:cs="Aptos"/>
@@ -7045,14 +6892,12 @@
               </w:rPr>
               <w:t xml:space="preserve">Autenticação </w:t>
             </w:r>
-            <w:proofErr w:type="spellStart"/>
-            <w:r>
-              <w:rPr>
-                <w:rFonts w:eastAsia="Aptos" w:cs="Aptos"/>
-              </w:rPr>
-              <w:t>mal-sucedida</w:t>
-            </w:r>
-            <w:proofErr w:type="spellEnd"/>
+            <w:r>
+              <w:rPr>
+                <w:rFonts w:eastAsia="Aptos" w:cs="Aptos"/>
+              </w:rPr>
+              <w:t>malsucedida</w:t>
+            </w:r>
           </w:p>
           <w:p>
             <w:pPr>
@@ -7359,13 +7204,13 @@
                 <w:b/>
                 <w:bCs/>
               </w:rPr>
-              <w:t>POSSO: g</w:t>
-            </w:r>
-            <w:r>
-              <w:rPr>
-                <w:rFonts w:eastAsia="Aptos" w:cs="Aptos"/>
-              </w:rPr>
-              <w:t>erenciar Frota de Maquinário</w:t>
+              <w:t xml:space="preserve">POSSO: </w:t>
+            </w:r>
+            <w:r>
+              <w:rPr>
+                <w:rFonts w:eastAsia="Aptos" w:cs="Aptos"/>
+              </w:rPr>
+              <w:t>Gerenciar Frota de Maquinário</w:t>
             </w:r>
           </w:p>
           <w:p>
@@ -7447,21 +7292,7 @@
               <w:rPr>
                 <w:rFonts w:eastAsia="Aptos" w:cs="Aptos"/>
               </w:rPr>
-              <w:t xml:space="preserve">o locador informa todos os dados obrigatórios do equipamento, incluindo número de registro no </w:t>
-            </w:r>
-            <w:proofErr w:type="spellStart"/>
-            <w:r>
-              <w:rPr>
-                <w:rFonts w:eastAsia="Aptos" w:cs="Aptos"/>
-              </w:rPr>
-              <w:t>Renagro</w:t>
-            </w:r>
-            <w:proofErr w:type="spellEnd"/>
-            <w:r>
-              <w:rPr>
-                <w:rFonts w:eastAsia="Aptos" w:cs="Aptos"/>
-              </w:rPr>
-              <w:t>, especificações técnicas e finalidade de uso</w:t>
+              <w:t>o locador informa todos os dados obrigatórios do equipamento, incluindo número de registro no Renagro, especificações técnicas e finalidade de uso</w:t>
             </w:r>
           </w:p>
           <w:p>
@@ -7545,14 +7376,12 @@
               </w:rPr>
               <w:t xml:space="preserve">Cadastro de maquinário </w:t>
             </w:r>
-            <w:proofErr w:type="spellStart"/>
-            <w:r>
-              <w:rPr>
-                <w:rFonts w:eastAsia="Aptos" w:cs="Aptos"/>
-              </w:rPr>
-              <w:t>mal-sucedido</w:t>
-            </w:r>
-            <w:proofErr w:type="spellEnd"/>
+            <w:r>
+              <w:rPr>
+                <w:rFonts w:eastAsia="Aptos" w:cs="Aptos"/>
+              </w:rPr>
+              <w:t>malsucedido</w:t>
+            </w:r>
           </w:p>
           <w:p>
             <w:pPr>
@@ -7861,7 +7690,6 @@
                 <w:b/>
                 <w:bCs/>
               </w:rPr>
-              <w:lastRenderedPageBreak/>
               <w:t xml:space="preserve">CRITÉRIOS DE ACEITAÇÃO 5: </w:t>
             </w:r>
             <w:r>
@@ -8046,18 +7874,19 @@
                 <w:b/>
                 <w:bCs/>
               </w:rPr>
-              <w:t>POSSO: g</w:t>
-            </w:r>
-            <w:r>
-              <w:rPr>
-                <w:rFonts w:eastAsia="Aptos" w:cs="Aptos"/>
-              </w:rPr>
-              <w:t>erenciar Anúncios de Locação</w:t>
-            </w:r>
-          </w:p>
-          <w:p>
-            <w:pPr>
-              <w:spacing w:before="240" w:after="240"/>
+              <w:t xml:space="preserve">POSSO: </w:t>
+            </w:r>
+            <w:r>
+              <w:rPr>
+                <w:rFonts w:eastAsia="Aptos" w:cs="Aptos"/>
+              </w:rPr>
+              <w:t>Gerenciar Anúncios de Locação</w:t>
+            </w:r>
+          </w:p>
+          <w:p>
+            <w:pPr>
+              <w:spacing w:before="120" w:after="120"/>
+              <w:ind w:left="30" w:hanging="30"/>
               <w:rPr>
                 <w:rFonts w:eastAsia="Aptos" w:cs="Aptos"/>
               </w:rPr>
@@ -8217,14 +8046,12 @@
               </w:rPr>
               <w:t xml:space="preserve">Publicação de anúncio </w:t>
             </w:r>
-            <w:proofErr w:type="spellStart"/>
-            <w:r>
-              <w:rPr>
-                <w:rFonts w:eastAsia="Aptos" w:cs="Aptos"/>
-              </w:rPr>
-              <w:t>mal-sucedida</w:t>
-            </w:r>
-            <w:proofErr w:type="spellEnd"/>
+            <w:r>
+              <w:rPr>
+                <w:rFonts w:eastAsia="Aptos" w:cs="Aptos"/>
+              </w:rPr>
+              <w:t>malsucedida</w:t>
+            </w:r>
           </w:p>
           <w:p>
             <w:pPr>
@@ -8551,7 +8378,6 @@
                 <w:b/>
                 <w:bCs/>
               </w:rPr>
-              <w:lastRenderedPageBreak/>
               <w:t>HISTÓRIA DO USUÁRIO – RF5</w:t>
             </w:r>
             <w:r>
@@ -8589,6 +8415,7 @@
                 <w:b/>
                 <w:bCs/>
               </w:rPr>
+              <w:lastRenderedPageBreak/>
               <w:t xml:space="preserve">COMO: </w:t>
             </w:r>
             <w:r>
@@ -8618,7 +8445,7 @@
               <w:rPr>
                 <w:rFonts w:eastAsia="Aptos" w:cs="Aptos"/>
               </w:rPr>
-              <w:t>filtrar busca de anúncios de locação</w:t>
+              <w:t>Filtrar Busca de Anúncios de Locação</w:t>
             </w:r>
           </w:p>
           <w:p>
@@ -9111,7 +8938,10 @@
                 <w:b/>
                 <w:bCs/>
               </w:rPr>
-              <w:t>RF6: Processar Contração de Aluguel</w:t>
+              <w:t xml:space="preserve">RF6: </w:t>
+            </w:r>
+            <w:r>
+              <w:t>Alugar Maquinário em Anúncio</w:t>
             </w:r>
           </w:p>
         </w:tc>
@@ -9144,7 +8974,14 @@
                 <w:rFonts w:cs="Calibri"/>
                 <w:color w:val="000000" w:themeColor="text1"/>
               </w:rPr>
-              <w:t>Locatário</w:t>
+              <w:t>l</w:t>
+            </w:r>
+            <w:r>
+              <w:rPr>
+                <w:rFonts w:cs="Calibri"/>
+                <w:color w:val="000000" w:themeColor="text1"/>
+              </w:rPr>
+              <w:t>ocatário</w:t>
             </w:r>
           </w:p>
           <w:p>
@@ -9166,11 +9003,7 @@
               <w:t xml:space="preserve">POSSO: </w:t>
             </w:r>
             <w:r>
-              <w:rPr>
-                <w:rFonts w:cs="Calibri"/>
-                <w:color w:val="000000" w:themeColor="text1"/>
-              </w:rPr>
-              <w:t>Realizar a Reserva e Pagamento de Aluguel</w:t>
+              <w:t>Alugar Maquinário em Anúncio</w:t>
             </w:r>
           </w:p>
           <w:p>
@@ -9196,7 +9029,14 @@
                 <w:rFonts w:cs="Calibri"/>
                 <w:color w:val="000000" w:themeColor="text1"/>
               </w:rPr>
-              <w:t>Ga</w:t>
+              <w:t>g</w:t>
+            </w:r>
+            <w:r>
+              <w:rPr>
+                <w:rFonts w:cs="Calibri"/>
+                <w:color w:val="000000" w:themeColor="text1"/>
+              </w:rPr>
+              <w:t>a</w:t>
             </w:r>
             <w:r>
               <w:rPr>
@@ -9329,33 +9169,33 @@
                 <w:bCs/>
                 <w:color w:val="000000" w:themeColor="text1"/>
               </w:rPr>
+              <w:t>QUANDO:</w:t>
+            </w:r>
+            <w:r>
+              <w:rPr>
+                <w:rFonts w:cs="Calibri"/>
+                <w:color w:val="000000" w:themeColor="text1"/>
+              </w:rPr>
+              <w:t xml:space="preserve"> solicita a confirmação da reserva</w:t>
+            </w:r>
+          </w:p>
+          <w:p>
+            <w:pPr>
+              <w:spacing w:before="120" w:after="120"/>
+              <w:ind w:left="168"/>
+              <w:rPr>
+                <w:rFonts w:cs="Calibri"/>
+                <w:color w:val="000000" w:themeColor="text1"/>
+              </w:rPr>
+            </w:pPr>
+            <w:r>
+              <w:rPr>
+                <w:rFonts w:cs="Calibri"/>
+                <w:b/>
+                <w:bCs/>
+                <w:color w:val="000000" w:themeColor="text1"/>
+              </w:rPr>
               <w:lastRenderedPageBreak/>
-              <w:t>QUANDO:</w:t>
-            </w:r>
-            <w:r>
-              <w:rPr>
-                <w:rFonts w:cs="Calibri"/>
-                <w:color w:val="000000" w:themeColor="text1"/>
-              </w:rPr>
-              <w:t xml:space="preserve"> solicita a confirmação da reserva</w:t>
-            </w:r>
-          </w:p>
-          <w:p>
-            <w:pPr>
-              <w:spacing w:before="120" w:after="120"/>
-              <w:ind w:left="168"/>
-              <w:rPr>
-                <w:rFonts w:cs="Calibri"/>
-                <w:color w:val="000000" w:themeColor="text1"/>
-              </w:rPr>
-            </w:pPr>
-            <w:r>
-              <w:rPr>
-                <w:rFonts w:cs="Calibri"/>
-                <w:b/>
-                <w:bCs/>
-                <w:color w:val="000000" w:themeColor="text1"/>
-              </w:rPr>
               <w:t>ENTÃO:</w:t>
             </w:r>
             <w:r>
@@ -9390,7 +9230,6 @@
                 <w:bCs/>
                 <w:color w:val="000000" w:themeColor="text1"/>
               </w:rPr>
-              <w:lastRenderedPageBreak/>
               <w:t xml:space="preserve">Critérios de Aceitação 2: </w:t>
             </w:r>
             <w:r>
@@ -9542,10 +9381,6 @@
               <w:t xml:space="preserve">RF7: </w:t>
             </w:r>
             <w:r>
-              <w:rPr>
-                <w:b/>
-                <w:bCs/>
-              </w:rPr>
               <w:t>Gerar Contrato de Aluguel Padrão</w:t>
             </w:r>
           </w:p>
@@ -9579,7 +9414,14 @@
                 <w:rFonts w:cs="Calibri"/>
                 <w:color w:val="000000" w:themeColor="text1"/>
               </w:rPr>
-              <w:t>Loca</w:t>
+              <w:t>l</w:t>
+            </w:r>
+            <w:r>
+              <w:rPr>
+                <w:rFonts w:cs="Calibri"/>
+                <w:color w:val="000000" w:themeColor="text1"/>
+              </w:rPr>
+              <w:t>oca</w:t>
             </w:r>
             <w:r>
               <w:rPr>
@@ -9636,11 +9478,9 @@
             <w:r>
               <w:rPr>
                 <w:rFonts w:cs="Calibri"/>
-                <w:b/>
-                <w:bCs/>
-                <w:color w:val="000000" w:themeColor="text1"/>
-              </w:rPr>
-              <w:t>F</w:t>
+                <w:color w:val="000000" w:themeColor="text1"/>
+              </w:rPr>
+              <w:t>f</w:t>
             </w:r>
             <w:r>
               <w:rPr>
@@ -10005,10 +9845,6 @@
               <w:t xml:space="preserve">HISTÓRIA DO USUÁRIO – RF8: </w:t>
             </w:r>
             <w:r>
-              <w:rPr>
-                <w:b/>
-                <w:bCs/>
-              </w:rPr>
               <w:t>Realizar Aceite Digital de Contrato</w:t>
             </w:r>
           </w:p>
@@ -10042,14 +9878,35 @@
                 <w:rFonts w:cs="Calibri"/>
                 <w:color w:val="000000" w:themeColor="text1"/>
               </w:rPr>
-              <w:t>Loca</w:t>
-            </w:r>
-            <w:r>
-              <w:rPr>
-                <w:rFonts w:cs="Calibri"/>
-                <w:color w:val="000000" w:themeColor="text1"/>
-              </w:rPr>
-              <w:t>dor ou Locatário</w:t>
+              <w:t>l</w:t>
+            </w:r>
+            <w:r>
+              <w:rPr>
+                <w:rFonts w:cs="Calibri"/>
+                <w:color w:val="000000" w:themeColor="text1"/>
+              </w:rPr>
+              <w:t>oca</w:t>
+            </w:r>
+            <w:r>
+              <w:rPr>
+                <w:rFonts w:cs="Calibri"/>
+                <w:color w:val="000000" w:themeColor="text1"/>
+              </w:rPr>
+              <w:t xml:space="preserve">dor ou </w:t>
+            </w:r>
+            <w:r>
+              <w:rPr>
+                <w:rFonts w:cs="Calibri"/>
+                <w:color w:val="000000" w:themeColor="text1"/>
+              </w:rPr>
+              <w:t>l</w:t>
+            </w:r>
+            <w:r>
+              <w:rPr>
+                <w:rFonts w:cs="Calibri"/>
+                <w:color w:val="000000" w:themeColor="text1"/>
+              </w:rPr>
+              <w:t>ocatário</w:t>
             </w:r>
           </w:p>
           <w:p>
@@ -10262,33 +10119,33 @@
                 <w:bCs/>
                 <w:color w:val="000000" w:themeColor="text1"/>
               </w:rPr>
+              <w:t xml:space="preserve">Critérios de Aceitação 2: </w:t>
+            </w:r>
+            <w:r>
+              <w:rPr>
+                <w:rFonts w:cs="Calibri"/>
+                <w:color w:val="000000" w:themeColor="text1"/>
+              </w:rPr>
+              <w:t>Expiração do prazo de aceite</w:t>
+            </w:r>
+          </w:p>
+          <w:p>
+            <w:pPr>
+              <w:spacing w:before="120" w:after="120"/>
+              <w:ind w:left="168"/>
+              <w:rPr>
+                <w:rFonts w:cs="Calibri"/>
+                <w:color w:val="000000" w:themeColor="text1"/>
+              </w:rPr>
+            </w:pPr>
+            <w:r>
+              <w:rPr>
+                <w:rFonts w:cs="Calibri"/>
+                <w:b/>
+                <w:bCs/>
+                <w:color w:val="000000" w:themeColor="text1"/>
+              </w:rPr>
               <w:lastRenderedPageBreak/>
-              <w:t xml:space="preserve">Critérios de Aceitação 2: </w:t>
-            </w:r>
-            <w:r>
-              <w:rPr>
-                <w:rFonts w:cs="Calibri"/>
-                <w:color w:val="000000" w:themeColor="text1"/>
-              </w:rPr>
-              <w:t>Expiração do prazo de aceite</w:t>
-            </w:r>
-          </w:p>
-          <w:p>
-            <w:pPr>
-              <w:spacing w:before="120" w:after="120"/>
-              <w:ind w:left="168"/>
-              <w:rPr>
-                <w:rFonts w:cs="Calibri"/>
-                <w:color w:val="000000" w:themeColor="text1"/>
-              </w:rPr>
-            </w:pPr>
-            <w:r>
-              <w:rPr>
-                <w:rFonts w:cs="Calibri"/>
-                <w:b/>
-                <w:bCs/>
-                <w:color w:val="000000" w:themeColor="text1"/>
-              </w:rPr>
               <w:t>DADO QUE:</w:t>
             </w:r>
             <w:r>
@@ -10414,10 +10271,6 @@
               <w:t xml:space="preserve">HISTÓRIA DO USUÁRIO – RF9: </w:t>
             </w:r>
             <w:r>
-              <w:rPr>
-                <w:b/>
-                <w:bCs/>
-              </w:rPr>
               <w:t>Gerenciar Contratos de Locação</w:t>
             </w:r>
           </w:p>
@@ -10451,14 +10304,35 @@
                 <w:rFonts w:cs="Calibri"/>
                 <w:color w:val="000000" w:themeColor="text1"/>
               </w:rPr>
-              <w:t>Loca</w:t>
-            </w:r>
-            <w:r>
-              <w:rPr>
-                <w:rFonts w:cs="Calibri"/>
-                <w:color w:val="000000" w:themeColor="text1"/>
-              </w:rPr>
-              <w:t>dor ou Locatário</w:t>
+              <w:t>l</w:t>
+            </w:r>
+            <w:r>
+              <w:rPr>
+                <w:rFonts w:cs="Calibri"/>
+                <w:color w:val="000000" w:themeColor="text1"/>
+              </w:rPr>
+              <w:t>oca</w:t>
+            </w:r>
+            <w:r>
+              <w:rPr>
+                <w:rFonts w:cs="Calibri"/>
+                <w:color w:val="000000" w:themeColor="text1"/>
+              </w:rPr>
+              <w:t xml:space="preserve">dor ou </w:t>
+            </w:r>
+            <w:r>
+              <w:rPr>
+                <w:rFonts w:cs="Calibri"/>
+                <w:color w:val="000000" w:themeColor="text1"/>
+              </w:rPr>
+              <w:t>l</w:t>
+            </w:r>
+            <w:r>
+              <w:rPr>
+                <w:rFonts w:cs="Calibri"/>
+                <w:color w:val="000000" w:themeColor="text1"/>
+              </w:rPr>
+              <w:t>ocatário</w:t>
             </w:r>
           </w:p>
           <w:p>
@@ -11070,27 +10944,7 @@
               <w:t xml:space="preserve">: </w:t>
             </w:r>
             <w:r>
-              <w:rPr>
-                <w:b/>
-                <w:bCs/>
-              </w:rPr>
-              <w:t xml:space="preserve">Calcular Cobrança Baseada no </w:t>
-            </w:r>
-            <w:proofErr w:type="spellStart"/>
-            <w:r>
-              <w:rPr>
-                <w:b/>
-                <w:bCs/>
-              </w:rPr>
-              <w:t>Horímetro</w:t>
-            </w:r>
-            <w:proofErr w:type="spellEnd"/>
-            <w:r>
-              <w:rPr>
-                <w:b/>
-                <w:bCs/>
-              </w:rPr>
-              <w:t xml:space="preserve"> do Maquinário</w:t>
+              <w:t>Calcular Cobrança Baseada no Horímetro do Maquinário</w:t>
             </w:r>
           </w:p>
         </w:tc>
@@ -11123,7 +10977,14 @@
                 <w:rFonts w:cs="Calibri"/>
                 <w:color w:val="000000" w:themeColor="text1"/>
               </w:rPr>
-              <w:t>Loca</w:t>
+              <w:t>l</w:t>
+            </w:r>
+            <w:r>
+              <w:rPr>
+                <w:rFonts w:cs="Calibri"/>
+                <w:color w:val="000000" w:themeColor="text1"/>
+              </w:rPr>
+              <w:t>oca</w:t>
             </w:r>
             <w:r>
               <w:rPr>
@@ -11145,17 +11006,11 @@
                 <w:bCs/>
                 <w:color w:val="000000" w:themeColor="text1"/>
               </w:rPr>
-              <w:lastRenderedPageBreak/>
               <w:t xml:space="preserve">POSSO: </w:t>
             </w:r>
             <w:r>
-              <w:t xml:space="preserve">Calcular Cobrança Baseada no </w:t>
-            </w:r>
-            <w:proofErr w:type="spellStart"/>
-            <w:r>
-              <w:t>Horímetro</w:t>
-            </w:r>
-            <w:proofErr w:type="spellEnd"/>
+              <w:t>Calcular Cobrança Baseada no Horímetro do Maquinário</w:t>
+            </w:r>
           </w:p>
           <w:p>
             <w:pPr>
@@ -11236,15 +11091,7 @@
               <w:t xml:space="preserve"> </w:t>
             </w:r>
             <w:r>
-              <w:t xml:space="preserve">o locador informa os valores de entrada e saída do </w:t>
-            </w:r>
-            <w:proofErr w:type="spellStart"/>
-            <w:r>
-              <w:t>horímetro</w:t>
-            </w:r>
-            <w:proofErr w:type="spellEnd"/>
-            <w:r>
-              <w:t xml:space="preserve"> conforme as especificações técnicas</w:t>
+              <w:t>o locador informa os valores de entrada e saída do horímetro conforme as especificações técnicas</w:t>
             </w:r>
           </w:p>
           <w:p>
@@ -11364,23 +11211,7 @@
                 <w:rFonts w:cs="Calibri"/>
                 <w:color w:val="000000" w:themeColor="text1"/>
               </w:rPr>
-              <w:t xml:space="preserve">o locador informa um </w:t>
-            </w:r>
-            <w:proofErr w:type="spellStart"/>
-            <w:r>
-              <w:rPr>
-                <w:rFonts w:cs="Calibri"/>
-                <w:color w:val="000000" w:themeColor="text1"/>
-              </w:rPr>
-              <w:t>horímetro</w:t>
-            </w:r>
-            <w:proofErr w:type="spellEnd"/>
-            <w:r>
-              <w:rPr>
-                <w:rFonts w:cs="Calibri"/>
-                <w:color w:val="000000" w:themeColor="text1"/>
-              </w:rPr>
-              <w:t xml:space="preserve"> final menor que o inicial ou valores não numéricos</w:t>
+              <w:t>o locador informa um horímetro final menor que o inicial ou valores não numéricos</w:t>
             </w:r>
           </w:p>
           <w:p>
@@ -11509,20 +11340,9 @@
             <w:r>
               <w:rPr>
                 <w:rFonts w:eastAsia="Arial" w:cs="Arial"/>
-                <w:b/>
-                <w:bCs/>
-                <w:color w:val="000000" w:themeColor="text1"/>
-              </w:rPr>
-              <w:t>Atualizar Dados da</w:t>
-            </w:r>
-            <w:r>
-              <w:rPr>
-                <w:rFonts w:eastAsia="Arial" w:cs="Arial"/>
-                <w:b/>
-                <w:bCs/>
-                <w:color w:val="000000" w:themeColor="text1"/>
-              </w:rPr>
-              <w:t xml:space="preserve"> Locação</w:t>
+                <w:color w:val="000000" w:themeColor="text1"/>
+              </w:rPr>
+              <w:t>Receber Notificações Sobre a Locação</w:t>
             </w:r>
           </w:p>
         </w:tc>
@@ -11560,7 +11380,42 @@
                 <w:rFonts w:eastAsia="Arial" w:cs="Arial"/>
                 <w:color w:val="000000" w:themeColor="text1"/>
               </w:rPr>
-              <w:t>Locador, Locatário ou Operador</w:t>
+              <w:t>l</w:t>
+            </w:r>
+            <w:r>
+              <w:rPr>
+                <w:rFonts w:eastAsia="Arial" w:cs="Arial"/>
+                <w:color w:val="000000" w:themeColor="text1"/>
+              </w:rPr>
+              <w:t xml:space="preserve">ocador, </w:t>
+            </w:r>
+            <w:r>
+              <w:rPr>
+                <w:rFonts w:eastAsia="Arial" w:cs="Arial"/>
+                <w:color w:val="000000" w:themeColor="text1"/>
+              </w:rPr>
+              <w:t>l</w:t>
+            </w:r>
+            <w:r>
+              <w:rPr>
+                <w:rFonts w:eastAsia="Arial" w:cs="Arial"/>
+                <w:color w:val="000000" w:themeColor="text1"/>
+              </w:rPr>
+              <w:t xml:space="preserve">ocatário ou </w:t>
+            </w:r>
+            <w:r>
+              <w:rPr>
+                <w:rFonts w:eastAsia="Arial" w:cs="Arial"/>
+                <w:color w:val="000000" w:themeColor="text1"/>
+              </w:rPr>
+              <w:t>o</w:t>
+            </w:r>
+            <w:r>
+              <w:rPr>
+                <w:rFonts w:eastAsia="Arial" w:cs="Arial"/>
+                <w:color w:val="000000" w:themeColor="text1"/>
+              </w:rPr>
+              <w:t>perador</w:t>
             </w:r>
           </w:p>
           <w:p>
@@ -11584,7 +11439,7 @@
                 <w:rFonts w:eastAsia="Arial" w:cs="Arial"/>
                 <w:color w:val="000000" w:themeColor="text1"/>
               </w:rPr>
-              <w:t>Solicitar alterações nos detalhes da locação (data, horário, duração) e notificar as demais partes</w:t>
+              <w:t>Receber Notificações Sobre a Locação</w:t>
             </w:r>
           </w:p>
           <w:p>
@@ -11608,7 +11463,14 @@
                 <w:rFonts w:eastAsia="Arial" w:cs="Arial"/>
                 <w:color w:val="000000" w:themeColor="text1"/>
               </w:rPr>
-              <w:t>manter todos os envolvidos informados sobre mudanças no agendamento do serviço</w:t>
+              <w:t>m</w:t>
+            </w:r>
+            <w:r>
+              <w:rPr>
+                <w:rFonts w:eastAsia="Arial" w:cs="Arial"/>
+                <w:color w:val="000000" w:themeColor="text1"/>
+              </w:rPr>
+              <w:t>e manter informado sobre mudanças no agendamento, confirmações, recusas e alterações de valores, sem precisar acessar o sistema ativamente</w:t>
             </w:r>
           </w:p>
         </w:tc>
@@ -11721,7 +11583,21 @@
                 <w:rFonts w:eastAsia="Arial" w:cs="Arial"/>
                 <w:color w:val="000000" w:themeColor="text1"/>
               </w:rPr>
-              <w:t>o sistema registra a solicitação, notifica as demais partes envolvidas (locador, locatário e operador) com os detalhes da alteração e aguarda o aceite de todos para confirmar a mudança</w:t>
+              <w:t>o sistema registra a solicitação</w:t>
+            </w:r>
+            <w:r>
+              <w:rPr>
+                <w:rFonts w:eastAsia="Arial" w:cs="Arial"/>
+                <w:color w:val="000000" w:themeColor="text1"/>
+              </w:rPr>
+              <w:t xml:space="preserve"> e</w:t>
+            </w:r>
+            <w:r>
+              <w:rPr>
+                <w:rFonts w:eastAsia="Arial" w:cs="Arial"/>
+                <w:color w:val="000000" w:themeColor="text1"/>
+              </w:rPr>
+              <w:t xml:space="preserve"> notifica as demais partes envolvidas (locador, locatário e operador) com os detalhes da alteração e aguarda o aceite de todos para confirmar a mudança</w:t>
             </w:r>
           </w:p>
         </w:tc>
@@ -11827,7 +11703,6 @@
                 <w:bCs/>
                 <w:color w:val="000000" w:themeColor="text1"/>
               </w:rPr>
-              <w:lastRenderedPageBreak/>
               <w:t xml:space="preserve">ENTÃO: </w:t>
             </w:r>
             <w:r>
@@ -12122,7 +11997,14 @@
                 <w:bCs/>
                 <w:color w:val="000000" w:themeColor="text1"/>
               </w:rPr>
-              <w:t>HISTÓRIA DO USUÁRIO – RF12: Avaliar Qualidade do Serviço de Operação</w:t>
+              <w:t xml:space="preserve">HISTÓRIA DO USUÁRIO – RF12: </w:t>
+            </w:r>
+            <w:r>
+              <w:rPr>
+                <w:rFonts w:eastAsia="Arial" w:cs="Arial"/>
+                <w:color w:val="000000" w:themeColor="text1"/>
+              </w:rPr>
+              <w:t>Avaliar Qualidade do Serviço de Operação</w:t>
             </w:r>
           </w:p>
         </w:tc>
@@ -12161,7 +12043,14 @@
                 <w:rFonts w:eastAsia="Arial" w:cs="Arial"/>
                 <w:color w:val="000000" w:themeColor="text1"/>
               </w:rPr>
-              <w:t>Locatário</w:t>
+              <w:t>l</w:t>
+            </w:r>
+            <w:r>
+              <w:rPr>
+                <w:rFonts w:eastAsia="Arial" w:cs="Arial"/>
+                <w:color w:val="000000" w:themeColor="text1"/>
+              </w:rPr>
+              <w:t>ocatário</w:t>
             </w:r>
           </w:p>
           <w:p>
@@ -12186,7 +12075,7 @@
                 <w:rFonts w:eastAsia="Arial" w:cs="Arial"/>
                 <w:color w:val="000000" w:themeColor="text1"/>
               </w:rPr>
-              <w:t>Avaliar a qualidade do serviço de operação prestado</w:t>
+              <w:t>Avaliar Qualidade do Serviço de Operação</w:t>
             </w:r>
           </w:p>
           <w:p>
@@ -12505,7 +12394,14 @@
                 <w:bCs/>
                 <w:color w:val="000000" w:themeColor="text1"/>
               </w:rPr>
-              <w:t>HISTÓRIA DO USUÁRIO – RF13: Avaliar Comportamento do Usuário</w:t>
+              <w:t xml:space="preserve">HISTÓRIA DO USUÁRIO – RF13: </w:t>
+            </w:r>
+            <w:r>
+              <w:rPr>
+                <w:rFonts w:eastAsia="Arial" w:cs="Arial"/>
+                <w:color w:val="000000" w:themeColor="text1"/>
+              </w:rPr>
+              <w:t>Avaliar Comportamento do Usuário</w:t>
             </w:r>
           </w:p>
         </w:tc>
@@ -12537,6 +12433,7 @@
                 <w:bCs/>
                 <w:color w:val="000000" w:themeColor="text1"/>
               </w:rPr>
+              <w:lastRenderedPageBreak/>
               <w:t xml:space="preserve">COMO: </w:t>
             </w:r>
             <w:r>
@@ -12544,7 +12441,28 @@
                 <w:rFonts w:eastAsia="Arial" w:cs="Arial"/>
                 <w:color w:val="000000" w:themeColor="text1"/>
               </w:rPr>
-              <w:t>Locador ou Operador</w:t>
+              <w:t>l</w:t>
+            </w:r>
+            <w:r>
+              <w:rPr>
+                <w:rFonts w:eastAsia="Arial" w:cs="Arial"/>
+                <w:color w:val="000000" w:themeColor="text1"/>
+              </w:rPr>
+              <w:t xml:space="preserve">ocador ou </w:t>
+            </w:r>
+            <w:r>
+              <w:rPr>
+                <w:rFonts w:eastAsia="Arial" w:cs="Arial"/>
+                <w:color w:val="000000" w:themeColor="text1"/>
+              </w:rPr>
+              <w:t>o</w:t>
+            </w:r>
+            <w:r>
+              <w:rPr>
+                <w:rFonts w:eastAsia="Arial" w:cs="Arial"/>
+                <w:color w:val="000000" w:themeColor="text1"/>
+              </w:rPr>
+              <w:t>perador</w:t>
             </w:r>
           </w:p>
           <w:p>
@@ -12569,7 +12487,7 @@
                 <w:rFonts w:eastAsia="Arial" w:cs="Arial"/>
                 <w:color w:val="000000" w:themeColor="text1"/>
               </w:rPr>
-              <w:t>Avaliar o comportamento do locatário após a locação</w:t>
+              <w:t>Avaliar Comportamento do Usuário</w:t>
             </w:r>
           </w:p>
           <w:p>
@@ -12906,7 +12824,14 @@
                 <w:bCs/>
                 <w:color w:val="000000" w:themeColor="text1"/>
               </w:rPr>
-              <w:t>: Conversar via Chat Interno</w:t>
+              <w:t xml:space="preserve">: </w:t>
+            </w:r>
+            <w:r>
+              <w:rPr>
+                <w:rFonts w:eastAsia="Arial" w:cs="Arial"/>
+                <w:color w:val="000000" w:themeColor="text1"/>
+              </w:rPr>
+              <w:t>Conversar via Chat Interno</w:t>
             </w:r>
           </w:p>
         </w:tc>
@@ -12945,7 +12870,42 @@
                 <w:rFonts w:eastAsia="Arial" w:cs="Arial"/>
                 <w:color w:val="000000" w:themeColor="text1"/>
               </w:rPr>
-              <w:t>Locador, Locatário ou Operador</w:t>
+              <w:t>l</w:t>
+            </w:r>
+            <w:r>
+              <w:rPr>
+                <w:rFonts w:eastAsia="Arial" w:cs="Arial"/>
+                <w:color w:val="000000" w:themeColor="text1"/>
+              </w:rPr>
+              <w:t xml:space="preserve">ocador, </w:t>
+            </w:r>
+            <w:r>
+              <w:rPr>
+                <w:rFonts w:eastAsia="Arial" w:cs="Arial"/>
+                <w:color w:val="000000" w:themeColor="text1"/>
+              </w:rPr>
+              <w:t>l</w:t>
+            </w:r>
+            <w:r>
+              <w:rPr>
+                <w:rFonts w:eastAsia="Arial" w:cs="Arial"/>
+                <w:color w:val="000000" w:themeColor="text1"/>
+              </w:rPr>
+              <w:t xml:space="preserve">ocatário ou </w:t>
+            </w:r>
+            <w:r>
+              <w:rPr>
+                <w:rFonts w:eastAsia="Arial" w:cs="Arial"/>
+                <w:color w:val="000000" w:themeColor="text1"/>
+              </w:rPr>
+              <w:t>o</w:t>
+            </w:r>
+            <w:r>
+              <w:rPr>
+                <w:rFonts w:eastAsia="Arial" w:cs="Arial"/>
+                <w:color w:val="000000" w:themeColor="text1"/>
+              </w:rPr>
+              <w:t>perador</w:t>
             </w:r>
           </w:p>
           <w:p>
@@ -12970,7 +12930,7 @@
                 <w:rFonts w:eastAsia="Arial" w:cs="Arial"/>
                 <w:color w:val="000000" w:themeColor="text1"/>
               </w:rPr>
-              <w:t>Enviar e receber mensagens pelo chat interno da plataforma</w:t>
+              <w:t>Conversar via Chat Interno</w:t>
             </w:r>
           </w:p>
           <w:p>
@@ -13196,7 +13156,6 @@
                 <w:bCs/>
                 <w:color w:val="000000" w:themeColor="text1"/>
               </w:rPr>
-              <w:lastRenderedPageBreak/>
               <w:t xml:space="preserve">QUANDO: </w:t>
             </w:r>
             <w:r>
@@ -13426,7 +13385,14 @@
                 <w:bCs/>
                 <w:color w:val="000000" w:themeColor="text1"/>
               </w:rPr>
-              <w:t>: Validar Credencial para Operação de Maquinário</w:t>
+              <w:t xml:space="preserve">: </w:t>
+            </w:r>
+            <w:r>
+              <w:rPr>
+                <w:rFonts w:eastAsia="Arial" w:cs="Arial"/>
+                <w:color w:val="000000" w:themeColor="text1"/>
+              </w:rPr>
+              <w:t>Validar Credencial para Operação de Maquinário</w:t>
             </w:r>
           </w:p>
         </w:tc>
@@ -13465,7 +13431,14 @@
                 <w:rFonts w:eastAsia="Arial" w:cs="Arial"/>
                 <w:color w:val="000000" w:themeColor="text1"/>
               </w:rPr>
-              <w:t>Operador</w:t>
+              <w:t>o</w:t>
+            </w:r>
+            <w:r>
+              <w:rPr>
+                <w:rFonts w:eastAsia="Arial" w:cs="Arial"/>
+                <w:color w:val="000000" w:themeColor="text1"/>
+              </w:rPr>
+              <w:t>perador</w:t>
             </w:r>
           </w:p>
           <w:p>
@@ -13490,7 +13463,7 @@
                 <w:rFonts w:eastAsia="Arial" w:cs="Arial"/>
                 <w:color w:val="000000" w:themeColor="text1"/>
               </w:rPr>
-              <w:t>Submeter minhas credenciais (CNH e certificações) para validação</w:t>
+              <w:t>Validar Credencial para Operação de Maquinário</w:t>
             </w:r>
           </w:p>
           <w:p>
@@ -13827,7 +13800,14 @@
                 <w:bCs/>
                 <w:color w:val="000000" w:themeColor="text1"/>
               </w:rPr>
-              <w:t>: Programar Recorrência de Aluguel</w:t>
+              <w:t xml:space="preserve">: </w:t>
+            </w:r>
+            <w:r>
+              <w:rPr>
+                <w:rFonts w:eastAsia="Arial" w:cs="Arial"/>
+                <w:color w:val="000000" w:themeColor="text1"/>
+              </w:rPr>
+              <w:t>Programar Recorrência de Aluguel</w:t>
             </w:r>
           </w:p>
         </w:tc>
@@ -13866,7 +13846,14 @@
                 <w:rFonts w:eastAsia="Arial" w:cs="Arial"/>
                 <w:color w:val="000000" w:themeColor="text1"/>
               </w:rPr>
-              <w:t>Locatário</w:t>
+              <w:t>l</w:t>
+            </w:r>
+            <w:r>
+              <w:rPr>
+                <w:rFonts w:eastAsia="Arial" w:cs="Arial"/>
+                <w:color w:val="000000" w:themeColor="text1"/>
+              </w:rPr>
+              <w:t>ocatário</w:t>
             </w:r>
           </w:p>
           <w:p>
@@ -13884,15 +13871,15 @@
                 <w:bCs/>
                 <w:color w:val="000000" w:themeColor="text1"/>
               </w:rPr>
-              <w:lastRenderedPageBreak/>
               <w:t xml:space="preserve">POSSO: </w:t>
             </w:r>
             <w:r>
               <w:rPr>
                 <w:rFonts w:eastAsia="Arial" w:cs="Arial"/>
-                <w:color w:val="000000" w:themeColor="text1"/>
-              </w:rPr>
-              <w:t>Programar a recorrência de um aluguel já realizado</w:t>
+                <w:bCs/>
+                <w:color w:val="000000" w:themeColor="text1"/>
+              </w:rPr>
+              <w:t>Programar Recorrência de Aluguel</w:t>
             </w:r>
           </w:p>
           <w:p>
@@ -14230,7 +14217,14 @@
                 <w:bCs/>
                 <w:color w:val="000000" w:themeColor="text1"/>
               </w:rPr>
-              <w:t>: Moderar Anúncios de Locação da Plataforma</w:t>
+              <w:t xml:space="preserve">: </w:t>
+            </w:r>
+            <w:r>
+              <w:rPr>
+                <w:rFonts w:eastAsia="Arial" w:cs="Arial"/>
+                <w:color w:val="000000" w:themeColor="text1"/>
+              </w:rPr>
+              <w:t>Moderar Anúncios de Locação da Plataforma</w:t>
             </w:r>
           </w:p>
         </w:tc>
@@ -14269,7 +14263,14 @@
                 <w:rFonts w:eastAsia="Arial" w:cs="Arial"/>
                 <w:color w:val="000000" w:themeColor="text1"/>
               </w:rPr>
-              <w:t>Administrador</w:t>
+              <w:t>a</w:t>
+            </w:r>
+            <w:r>
+              <w:rPr>
+                <w:rFonts w:eastAsia="Arial" w:cs="Arial"/>
+                <w:color w:val="000000" w:themeColor="text1"/>
+              </w:rPr>
+              <w:t>dministrador</w:t>
             </w:r>
           </w:p>
           <w:p>
@@ -14294,7 +14295,7 @@
                 <w:rFonts w:eastAsia="Arial" w:cs="Arial"/>
                 <w:color w:val="000000" w:themeColor="text1"/>
               </w:rPr>
-              <w:t>Revisar e moderar os anúncios de locação publicados na plataforma</w:t>
+              <w:t>Moderar Anúncios de Locação da Plataforma</w:t>
             </w:r>
           </w:p>
           <w:p>
@@ -14546,7 +14547,6 @@
                 <w:bCs/>
                 <w:color w:val="000000" w:themeColor="text1"/>
               </w:rPr>
-              <w:lastRenderedPageBreak/>
               <w:t xml:space="preserve">ENTÃO: </w:t>
             </w:r>
             <w:r>
@@ -14586,33 +14586,33 @@
                 <w:bCs/>
                 <w:color w:val="000000" w:themeColor="text1"/>
               </w:rPr>
+              <w:t xml:space="preserve">Critérios de Aceitação 3: </w:t>
+            </w:r>
+            <w:r>
+              <w:rPr>
+                <w:rFonts w:eastAsia="Arial" w:cs="Arial"/>
+                <w:color w:val="000000" w:themeColor="text1"/>
+              </w:rPr>
+              <w:t>Suspensão preventiva de anúncio</w:t>
+            </w:r>
+          </w:p>
+          <w:p>
+            <w:pPr>
+              <w:shd w:val="clear" w:color="auto" w:fill="FFFFFF" w:themeFill="background1"/>
+              <w:spacing w:before="120" w:after="120"/>
+              <w:ind w:left="360"/>
+              <w:rPr>
+                <w:color w:val="000000" w:themeColor="text1"/>
+              </w:rPr>
+            </w:pPr>
+            <w:r>
+              <w:rPr>
+                <w:rFonts w:eastAsia="Arial" w:cs="Arial"/>
+                <w:b/>
+                <w:bCs/>
+                <w:color w:val="000000" w:themeColor="text1"/>
+              </w:rPr>
               <w:lastRenderedPageBreak/>
-              <w:t xml:space="preserve">Critérios de Aceitação 3: </w:t>
-            </w:r>
-            <w:r>
-              <w:rPr>
-                <w:rFonts w:eastAsia="Arial" w:cs="Arial"/>
-                <w:color w:val="000000" w:themeColor="text1"/>
-              </w:rPr>
-              <w:t>Suspensão preventiva de anúncio</w:t>
-            </w:r>
-          </w:p>
-          <w:p>
-            <w:pPr>
-              <w:shd w:val="clear" w:color="auto" w:fill="FFFFFF" w:themeFill="background1"/>
-              <w:spacing w:before="120" w:after="120"/>
-              <w:ind w:left="360"/>
-              <w:rPr>
-                <w:color w:val="000000" w:themeColor="text1"/>
-              </w:rPr>
-            </w:pPr>
-            <w:r>
-              <w:rPr>
-                <w:rFonts w:eastAsia="Arial" w:cs="Arial"/>
-                <w:b/>
-                <w:bCs/>
-                <w:color w:val="000000" w:themeColor="text1"/>
-              </w:rPr>
               <w:t xml:space="preserve">DADO QUE: </w:t>
             </w:r>
             <w:r>
@@ -14750,7 +14750,14 @@
                 <w:bCs/>
                 <w:color w:val="000000" w:themeColor="text1"/>
               </w:rPr>
-              <w:t>: Moderar Usuários da Plataforma</w:t>
+              <w:t xml:space="preserve">: </w:t>
+            </w:r>
+            <w:r>
+              <w:rPr>
+                <w:rFonts w:eastAsia="Arial" w:cs="Arial"/>
+                <w:color w:val="000000" w:themeColor="text1"/>
+              </w:rPr>
+              <w:t>Moderar Usuários da Plataforma</w:t>
             </w:r>
           </w:p>
         </w:tc>
@@ -14789,7 +14796,14 @@
                 <w:rFonts w:eastAsia="Arial" w:cs="Arial"/>
                 <w:color w:val="000000" w:themeColor="text1"/>
               </w:rPr>
-              <w:t>Administrador</w:t>
+              <w:t>a</w:t>
+            </w:r>
+            <w:r>
+              <w:rPr>
+                <w:rFonts w:eastAsia="Arial" w:cs="Arial"/>
+                <w:color w:val="000000" w:themeColor="text1"/>
+              </w:rPr>
+              <w:t>dministrador</w:t>
             </w:r>
           </w:p>
           <w:p>
@@ -14812,9 +14826,10 @@
             <w:r>
               <w:rPr>
                 <w:rFonts w:eastAsia="Arial" w:cs="Arial"/>
-                <w:color w:val="000000" w:themeColor="text1"/>
-              </w:rPr>
-              <w:t>Revisar e moderar os usuários cadastrados na plataforma</w:t>
+                <w:bCs/>
+                <w:color w:val="000000" w:themeColor="text1"/>
+              </w:rPr>
+              <w:t>Moderar Usuários da Plataforma</w:t>
             </w:r>
           </w:p>
           <w:p>
@@ -15197,6 +15212,9 @@
       </w:tr>
     </w:tbl>
     <w:p/>
+    <w:p/>
+    <w:p/>
+    <w:p/>
     <w:p>
       <w:pPr>
         <w:pStyle w:val="Heading1"/>
@@ -15209,63 +15227,6 @@
       <w:bookmarkEnd w:id="12"/>
     </w:p>
     <w:p/>
-    <w:p>
-      <w:pPr>
-        <w:ind w:left="360"/>
-        <w:rPr>
-          <w:color w:val="00B0F0"/>
-        </w:rPr>
-      </w:pPr>
-      <w:r>
-        <w:rPr>
-          <w:color w:val="00B0F0"/>
-        </w:rPr>
-        <w:t>Define as ENTIDADES que atendem ao TEMA do projeto, de acordo com os REQUISITOS FUNCIONAIS mapeados.</w:t>
-      </w:r>
-    </w:p>
-    <w:p>
-      <w:pPr>
-        <w:ind w:left="360"/>
-        <w:rPr>
-          <w:color w:val="00B0F0"/>
-        </w:rPr>
-      </w:pPr>
-      <w:r>
-        <w:rPr>
-          <w:color w:val="00B0F0"/>
-        </w:rPr>
-        <w:t>A equipe deve d</w:t>
-      </w:r>
-      <w:r>
-        <w:rPr>
-          <w:color w:val="00B0F0"/>
-        </w:rPr>
-        <w:t>esenha</w:t>
-      </w:r>
-      <w:r>
-        <w:rPr>
-          <w:color w:val="00B0F0"/>
-        </w:rPr>
-        <w:t>r</w:t>
-      </w:r>
-      <w:r>
-        <w:rPr>
-          <w:color w:val="00B0F0"/>
-        </w:rPr>
-        <w:t xml:space="preserve"> o modelo em um diagrama de classes ou diagrama entidade-relacionamento</w:t>
-      </w:r>
-      <w:r>
-        <w:rPr>
-          <w:color w:val="00B0F0"/>
-        </w:rPr>
-        <w:t>.</w:t>
-      </w:r>
-    </w:p>
-    <w:p>
-      <w:pPr>
-        <w:ind w:left="360"/>
-      </w:pPr>
-    </w:p>
     <w:tbl>
       <w:tblPr>
         <w:tblStyle w:val="TableGrid"/>
@@ -15273,7 +15234,7 @@
         <w:tblLook w:val="04A0" w:firstRow="1" w:lastRow="0" w:firstColumn="1" w:lastColumn="0" w:noHBand="0" w:noVBand="1"/>
       </w:tblPr>
       <w:tblGrid>
-        <w:gridCol w:w="8494"/>
+        <w:gridCol w:w="8819"/>
       </w:tblGrid>
       <w:tr>
         <w:trPr>
@@ -15312,6 +15273,47 @@
                 <w:bCs/>
               </w:rPr>
             </w:pPr>
+            <w:r>
+              <w:rPr>
+                <w:b/>
+                <w:bCs/>
+              </w:rPr>
+              <w:drawing>
+                <wp:inline distT="0" distB="0" distL="0" distR="0" wp14:anchorId="777F3F1B" wp14:editId="58E797AD">
+                  <wp:extent cx="5496449" cy="2748536"/>
+                  <wp:effectExtent l="0" t="0" r="3175" b="0"/>
+                  <wp:docPr id="226799143" name="Picture 1"/>
+                  <wp:cNvGraphicFramePr>
+                    <a:graphicFrameLocks xmlns:a="http://schemas.openxmlformats.org/drawingml/2006/main" noChangeAspect="1"/>
+                  </wp:cNvGraphicFramePr>
+                  <a:graphic xmlns:a="http://schemas.openxmlformats.org/drawingml/2006/main">
+                    <a:graphicData uri="http://schemas.openxmlformats.org/drawingml/2006/picture">
+                      <pic:pic xmlns:pic="http://schemas.openxmlformats.org/drawingml/2006/picture">
+                        <pic:nvPicPr>
+                          <pic:cNvPr id="226799143" name=""/>
+                          <pic:cNvPicPr/>
+                        </pic:nvPicPr>
+                        <pic:blipFill>
+                          <a:blip r:embed="rId11"/>
+                          <a:stretch>
+                            <a:fillRect/>
+                          </a:stretch>
+                        </pic:blipFill>
+                        <pic:spPr>
+                          <a:xfrm>
+                            <a:off x="0" y="0"/>
+                            <a:ext cx="5526614" cy="2763620"/>
+                          </a:xfrm>
+                          <a:prstGeom prst="rect">
+                            <a:avLst/>
+                          </a:prstGeom>
+                        </pic:spPr>
+                      </pic:pic>
+                    </a:graphicData>
+                  </a:graphic>
+                </wp:inline>
+              </w:drawing>
+            </w:r>
           </w:p>
           <w:p>
             <w:pPr>
@@ -16594,11 +16596,11 @@
                           </pic:cNvPicPr>
                         </pic:nvPicPr>
                         <pic:blipFill>
-                          <a:blip r:embed="rId11" cstate="print">
+                          <a:blip r:embed="rId12" cstate="print">
                             <a:extLst>
                               <a:ext uri="{BEBA8EAE-BF5A-486C-A8C5-ECC9F3942E4B}">
                                 <a14:imgProps xmlns:a14="http://schemas.microsoft.com/office/drawing/2010/main">
-                                  <a14:imgLayer r:embed="rId12">
+                                  <a14:imgLayer r:embed="rId13">
                                     <a14:imgEffect>
                                       <a14:colorTemperature colorTemp="5900"/>
                                     </a14:imgEffect>
@@ -16638,8 +16640,8 @@
     </w:tbl>
     <w:p/>
     <w:sectPr>
-      <w:headerReference w:type="default" r:id="rId13"/>
-      <w:footerReference w:type="default" r:id="rId14"/>
+      <w:headerReference w:type="default" r:id="rId14"/>
+      <w:footerReference w:type="default" r:id="rId15"/>
       <w:pgSz w:w="11906" w:h="16838"/>
       <w:pgMar w:top="1417" w:right="1376" w:bottom="1417" w:left="1701" w:header="708" w:footer="708" w:gutter="0"/>
       <w:cols w:space="708"/>

</xml_diff>

<commit_message>
docs: Update user story actor
</commit_message>
<xml_diff>
--- a/Documentation/bsi-especificacao-projeto-frota-rural.docx
+++ b/Documentation/bsi-especificacao-projeto-frota-rural.docx
@@ -7690,6 +7690,7 @@
                 <w:b/>
                 <w:bCs/>
               </w:rPr>
+              <w:lastRenderedPageBreak/>
               <w:t xml:space="preserve">CRITÉRIOS DE ACEITAÇÃO 5: </w:t>
             </w:r>
             <w:r>
@@ -9230,6 +9231,7 @@
                 <w:bCs/>
                 <w:color w:val="000000" w:themeColor="text1"/>
               </w:rPr>
+              <w:lastRenderedPageBreak/>
               <w:t xml:space="preserve">Critérios de Aceitação 2: </w:t>
             </w:r>
             <w:r>
@@ -13431,6 +13433,20 @@
                 <w:rFonts w:eastAsia="Arial" w:cs="Arial"/>
                 <w:color w:val="000000" w:themeColor="text1"/>
               </w:rPr>
+              <w:t>locador</w:t>
+            </w:r>
+            <w:r>
+              <w:rPr>
+                <w:rFonts w:eastAsia="Arial" w:cs="Arial"/>
+                <w:color w:val="000000" w:themeColor="text1"/>
+              </w:rPr>
+              <w:t xml:space="preserve"> ou </w:t>
+            </w:r>
+            <w:r>
+              <w:rPr>
+                <w:rFonts w:eastAsia="Arial" w:cs="Arial"/>
+                <w:color w:val="000000" w:themeColor="text1"/>
+              </w:rPr>
               <w:t>o</w:t>
             </w:r>
             <w:r>
@@ -15277,6 +15293,7 @@
               <w:rPr>
                 <w:b/>
                 <w:bCs/>
+                <w:noProof/>
               </w:rPr>
               <w:drawing>
                 <wp:inline distT="0" distB="0" distL="0" distR="0" wp14:anchorId="777F3F1B" wp14:editId="58E797AD">
@@ -21684,6 +21701,15 @@
 </file>
 
 <file path=customXml/item1.xml><?xml version="1.0" encoding="utf-8"?>
+<?mso-contentType ?>
+<FormTemplates xmlns="http://schemas.microsoft.com/sharepoint/v3/contenttype/forms">
+  <Display>DocumentLibraryForm</Display>
+  <Edit>DocumentLibraryForm</Edit>
+  <New>DocumentLibraryForm</New>
+</FormTemplates>
+</file>
+
+<file path=customXml/item2.xml><?xml version="1.0" encoding="utf-8"?>
 <ct:contentTypeSchema xmlns:ct="http://schemas.microsoft.com/office/2006/metadata/contentType" xmlns:ma="http://schemas.microsoft.com/office/2006/metadata/properties/metaAttributes" ct:_="" ma:_="" ma:contentTypeName="Document" ma:contentTypeID="0x0101007D6FB4E6DB7602489515A560918BAFE6" ma:contentTypeVersion="13" ma:contentTypeDescription="Create a new document." ma:contentTypeScope="" ma:versionID="bf9106d78c36f490dcfbb54944cc84b8">
   <xsd:schema xmlns:xsd="http://www.w3.org/2001/XMLSchema" xmlns:xs="http://www.w3.org/2001/XMLSchema" xmlns:p="http://schemas.microsoft.com/office/2006/metadata/properties" xmlns:ns2="4e068848-ab80-442e-9411-f6a9d9591f59" xmlns:ns3="311e6695-f330-4e01-8cd5-d41d4d3de720" targetNamespace="http://schemas.microsoft.com/office/2006/metadata/properties" ma:root="true" ma:fieldsID="951d4e4389adcb50a73cd82a02442d05" ns2:_="" ns3:_="">
     <xsd:import namespace="4e068848-ab80-442e-9411-f6a9d9591f59"/>
@@ -21906,20 +21932,7 @@
 </ct:contentTypeSchema>
 </file>
 
-<file path=customXml/item2.xml><?xml version="1.0" encoding="utf-8"?>
-<?mso-contentType ?>
-<FormTemplates xmlns="http://schemas.microsoft.com/sharepoint/v3/contenttype/forms">
-  <Display>DocumentLibraryForm</Display>
-  <Edit>DocumentLibraryForm</Edit>
-  <New>DocumentLibraryForm</New>
-</FormTemplates>
-</file>
-
 <file path=customXml/item3.xml><?xml version="1.0" encoding="utf-8"?>
-<b:Sources xmlns:b="http://schemas.openxmlformats.org/officeDocument/2006/bibliography" xmlns="http://schemas.openxmlformats.org/officeDocument/2006/bibliography" SelectedStyle="\APASixthEditionOfficeOnline.xsl" StyleName="APA" Version="6"/>
-</file>
-
-<file path=customXml/item4.xml><?xml version="1.0" encoding="utf-8"?>
 <p:properties xmlns:p="http://schemas.microsoft.com/office/2006/metadata/properties" xmlns:xsi="http://www.w3.org/2001/XMLSchema-instance" xmlns:pc="http://schemas.microsoft.com/office/infopath/2007/PartnerControls">
   <documentManagement>
     <lcf76f155ced4ddcb4097134ff3c332f xmlns="4e068848-ab80-442e-9411-f6a9d9591f59">
@@ -21930,7 +21943,19 @@
 </p:properties>
 </file>
 
+<file path=customXml/item4.xml><?xml version="1.0" encoding="utf-8"?>
+<b:Sources xmlns:b="http://schemas.openxmlformats.org/officeDocument/2006/bibliography" xmlns="http://schemas.openxmlformats.org/officeDocument/2006/bibliography" SelectedStyle="\APASixthEditionOfficeOnline.xsl" StyleName="APA" Version="6"/>
+</file>
+
 <file path=customXml/itemProps1.xml><?xml version="1.0" encoding="utf-8"?>
+<ds:datastoreItem xmlns:ds="http://schemas.openxmlformats.org/officeDocument/2006/customXml" ds:itemID="{11B1DE72-80E9-4162-B852-7908AAB96FDA}">
+  <ds:schemaRefs>
+    <ds:schemaRef ds:uri="http://schemas.microsoft.com/sharepoint/v3/contenttype/forms"/>
+  </ds:schemaRefs>
+</ds:datastoreItem>
+</file>
+
+<file path=customXml/itemProps2.xml><?xml version="1.0" encoding="utf-8"?>
 <ds:datastoreItem xmlns:ds="http://schemas.openxmlformats.org/officeDocument/2006/customXml" ds:itemID="{236E31FC-267B-4E91-AE6F-31587CB0AD2E}">
   <ds:schemaRefs>
     <ds:schemaRef ds:uri="http://schemas.microsoft.com/office/2006/metadata/contentType"/>
@@ -21949,23 +21974,7 @@
 </ds:datastoreItem>
 </file>
 
-<file path=customXml/itemProps2.xml><?xml version="1.0" encoding="utf-8"?>
-<ds:datastoreItem xmlns:ds="http://schemas.openxmlformats.org/officeDocument/2006/customXml" ds:itemID="{11B1DE72-80E9-4162-B852-7908AAB96FDA}">
-  <ds:schemaRefs>
-    <ds:schemaRef ds:uri="http://schemas.microsoft.com/sharepoint/v3/contenttype/forms"/>
-  </ds:schemaRefs>
-</ds:datastoreItem>
-</file>
-
 <file path=customXml/itemProps3.xml><?xml version="1.0" encoding="utf-8"?>
-<ds:datastoreItem xmlns:ds="http://schemas.openxmlformats.org/officeDocument/2006/customXml" ds:itemID="{5070FE65-AA96-43AB-8429-E23F25CB8DC5}">
-  <ds:schemaRefs>
-    <ds:schemaRef ds:uri="http://schemas.openxmlformats.org/officeDocument/2006/bibliography"/>
-  </ds:schemaRefs>
-</ds:datastoreItem>
-</file>
-
-<file path=customXml/itemProps4.xml><?xml version="1.0" encoding="utf-8"?>
 <ds:datastoreItem xmlns:ds="http://schemas.openxmlformats.org/officeDocument/2006/customXml" ds:itemID="{95F86C99-42FA-4EA1-8E50-0FBF23CAF963}">
   <ds:schemaRefs>
     <ds:schemaRef ds:uri="http://schemas.microsoft.com/office/2006/metadata/properties"/>
@@ -21976,6 +21985,14 @@
 </ds:datastoreItem>
 </file>
 
+<file path=customXml/itemProps4.xml><?xml version="1.0" encoding="utf-8"?>
+<ds:datastoreItem xmlns:ds="http://schemas.openxmlformats.org/officeDocument/2006/customXml" ds:itemID="{5070FE65-AA96-43AB-8429-E23F25CB8DC5}">
+  <ds:schemaRefs>
+    <ds:schemaRef ds:uri="http://schemas.openxmlformats.org/officeDocument/2006/bibliography"/>
+  </ds:schemaRefs>
+</ds:datastoreItem>
+</file>
+
 <file path=docMetadata/LabelInfo.xml><?xml version="1.0" encoding="utf-8"?>
 <clbl:labelList xmlns:clbl="http://schemas.microsoft.com/office/2020/mipLabelMetadata">
   <clbl:label id="{8a1ef6c3-8324-4103-bf4a-1328c5dc3653}" enabled="0" method="" siteId="{8a1ef6c3-8324-4103-bf4a-1328c5dc3653}" removed="1"/>

</xml_diff>